<commit_message>
refactor(brand): rename FX·King → Rebound across the system
Full rebrand of the visible brand and internal naming:
- Display name FX·King → Rebound on landing, bot, miniapp, admin, docs.
- npm scope @fxking/* → @rebound/* (all package.json + imports + turbo
  filters in Dockerfile/CI).
- Infra names fxking-* → rebound-* (render.yaml), domains *.fxking.io/app
  → *.rebound.app (.env.example, vercel CSP, configs).
- Bot handle FxKingBot/FXKingBot → ReboundBot (+ /app deep link).
- Regenerated economics.xlsx + 4 legal .docx from rebranded generators.
- Tagline: "Every trade rebounds — in cash."

No behavioural change; compliance constants and gates untouched.

https://claude.ai/code/session_015A9R3NuW3DbezVMZHYA6VU
</commit_message>
<xml_diff>
--- a/docs/legal/01-ASZF-TC.docx
+++ b/docs/legal/01-ASZF-TC.docx
@@ -52,7 +52,7 @@
           <w:color w:val="555B62"/>
           <w:sz w:val="20"/>
         </w:rPr>
-        <w:t>FX·King — cashback-alapú forex affiliate companion · Telegram Mini App</w:t>
+        <w:t>Rebound — cashback-alapú forex affiliate companion · Telegram Mini App</w:t>
       </w:r>
     </w:p>
     <w:tbl>
@@ -193,7 +193,7 @@
         <w:rPr>
           <w:b w:val="0"/>
         </w:rPr>
-        <w:t>1.1. Az FX·King-et a [CÉGNÉV] ([cégjegyzékszám], [székhely]) üzemelteti („Szolgáltató”). Az FX·King egy companion eszköz, amely partner-brokereknél végzett kereskedés után cashback (rebate) visszatérítést és kapcsolódó eszközöket (napló, kalkulátor, kockázati coach) nyújt.</w:t>
+        <w:t>1.1. Az Rebound-et a [CÉGNÉV] ([cégjegyzékszám], [székhely]) üzemelteti („Szolgáltató”). Az Rebound egy companion eszköz, amely partner-brokereknél végzett kereskedés után cashback (rebate) visszatérítést és kapcsolódó eszközöket (napló, kalkulátor, kockázati coach) nyújt.</w:t>
       </w:r>
     </w:p>
     <w:p>
@@ -201,7 +201,7 @@
         <w:rPr>
           <w:b/>
         </w:rPr>
-        <w:t>1.2. Az FX·King NEM broker, NEM befektetési szolgáltató, és NEM ad befektetési tanácsot. A kereskedés a partner-broker felületén, a broker szabályzata szerint történik.</w:t>
+        <w:t>1.2. Az Rebound NEM broker, NEM befektetési szolgáltató, és NEM ad befektetési tanácsot. A kereskedés a partner-broker felületén, a broker szabályzata szerint történik.</w:t>
       </w:r>
     </w:p>
     <w:p>
@@ -395,7 +395,7 @@
           <w:b w:val="0"/>
           <w:color w:val="C01A1A"/>
         </w:rPr>
-        <w:t>A CFD-ek és a forex (deviza) kereskedés magas kockázattal jár, és a befektetett tőke teljes elvesztésével járhat. A kiskereskedelmi CFD-számlák [ESMA %]-a veszít pénzt ennél a szolgáltatónál. Ez nem befektetési tanács. Az FX·King eszközöket kínál, nem javaslatokat (Tools, not tips).</w:t>
+        <w:t>A CFD-ek és a forex (deviza) kereskedés magas kockázattal jár, és a befektetett tőke teljes elvesztésével járhat. A kiskereskedelmi CFD-számlák [ESMA %]-a veszít pénzt ennél a szolgáltatónál. Ez nem befektetési tanács. Az Rebound eszközöket kínál, nem javaslatokat (Tools, not tips).</w:t>
       </w:r>
     </w:p>
     <w:p>

</xml_diff>